<commit_message>
[UC 03]: Đồng bộ và rà soát comment trong source khớp với mô tả trong báo cáo
</commit_message>
<xml_diff>
--- a/docs/Thu2_Ca3_Nhom4_23130223_PhamTuyetNhi.docx
+++ b/docs/Thu2_Ca3_Nhom4_23130223_PhamTuyetNhi.docx
@@ -14,6 +14,8 @@
           <w:szCs w:val="24"/>
         </w:rPr>
       </w:pPr>
+      <w:bookmarkStart w:id="57" w:name="_GoBack"/>
+      <w:bookmarkEnd w:id="57"/>
     </w:p>
     <w:p>
       <w:pPr>
@@ -1726,6 +1728,12 @@
             <w:insideH w:val="single" w:color="000000" w:sz="4" w:space="0"/>
             <w:insideV w:val="single" w:color="000000" w:sz="4" w:space="0"/>
           </w:tblBorders>
+          <w:tblCellMar>
+            <w:top w:w="0" w:type="dxa"/>
+            <w:left w:w="108" w:type="dxa"/>
+            <w:bottom w:w="0" w:type="dxa"/>
+            <w:right w:w="108" w:type="dxa"/>
+          </w:tblCellMar>
         </w:tblPrEx>
         <w:tc>
           <w:tcPr>
@@ -4255,8 +4263,8 @@
       <w:bookmarkStart w:id="8" w:name="_Toc3516"/>
       <w:bookmarkStart w:id="9" w:name="_Toc228888348"/>
       <w:bookmarkStart w:id="10" w:name="_Toc229943261"/>
-      <w:bookmarkStart w:id="11" w:name="_Toc229251621"/>
-      <w:bookmarkStart w:id="12" w:name="_Toc228887504"/>
+      <w:bookmarkStart w:id="11" w:name="_Toc228887504"/>
+      <w:bookmarkStart w:id="12" w:name="_Toc229251621"/>
       <w:r>
         <w:t>1.1. Tổng quan đề tài</w:t>
       </w:r>
@@ -4307,9 +4315,9 @@
           <w:lang w:val="en-US"/>
         </w:rPr>
       </w:pPr>
-      <w:bookmarkStart w:id="13" w:name="_Toc228888349"/>
-      <w:bookmarkStart w:id="14" w:name="_Toc229251622"/>
-      <w:bookmarkStart w:id="15" w:name="_Toc229943262"/>
+      <w:bookmarkStart w:id="13" w:name="_Toc229251622"/>
+      <w:bookmarkStart w:id="14" w:name="_Toc229943262"/>
+      <w:bookmarkStart w:id="15" w:name="_Toc228888349"/>
       <w:bookmarkStart w:id="16" w:name="_Toc228887505"/>
       <w:bookmarkStart w:id="17" w:name="_Toc4596"/>
       <w:r>
@@ -6800,12 +6808,6 @@
             <w:insideH w:val="single" w:color="auto" w:sz="4" w:space="0"/>
             <w:insideV w:val="single" w:color="auto" w:sz="4" w:space="0"/>
           </w:tblBorders>
-          <w:tblCellMar>
-            <w:top w:w="0" w:type="dxa"/>
-            <w:left w:w="108" w:type="dxa"/>
-            <w:bottom w:w="0" w:type="dxa"/>
-            <w:right w:w="108" w:type="dxa"/>
-          </w:tblCellMar>
         </w:tblPrEx>
         <w:tc>
           <w:tcPr>
@@ -6823,9 +6825,9 @@
                 <w:lang w:val="en-US"/>
               </w:rPr>
             </w:pPr>
-            <w:bookmarkStart w:id="20" w:name="_Toc228888351"/>
+            <w:bookmarkStart w:id="20" w:name="_Toc229943264"/>
             <w:bookmarkStart w:id="21" w:name="_Toc228887507"/>
-            <w:bookmarkStart w:id="22" w:name="_Toc229943264"/>
+            <w:bookmarkStart w:id="22" w:name="_Toc228888351"/>
             <w:bookmarkStart w:id="23" w:name="_Toc229251624"/>
             <w:r>
               <w:t>FR01</w:t>
@@ -8453,7 +8455,7 @@
               <w:rPr>
                 <w:szCs w:val="26"/>
               </w:rPr>
-              <w:t>UC03 – Tìm kiếm phim</w:t>
+              <w:t>UC04 – Xem chi tiết phim</w:t>
             </w:r>
           </w:p>
         </w:tc>
@@ -9901,7 +9903,7 @@
                 <w:sz w:val="24"/>
                 <w:szCs w:val="24"/>
               </w:rPr>
-              <w:t>Chức năng cho phép khách hàng tìm kiếm phim theo tên hoặc thể loại. Hệ thống hỗ trợ tìm kiếm có dấu và không dấu, lọc kết quả theo thể loại, độ tuổi và trạng thái chiếu. Từ khóa được giữ lại khi khách hàng điều hướng sang trang chi tiết phim và quay lại. tuổi, ngày khởi chiếu, mô tả nội dung và trailer. Từ trang chi tiết phim, khách hàng có thể chuyển sang xem lịch chiếu (UC05) để tiếp tục đặt vé.</w:t>
+              <w:t>Chức năng cho phép khách hàng tìm kiếm phim theo tên hoặc thể loại. Hệ thống hỗ trợ tìm kiếm có dấu và không dấu, lọc kết quả theo thể loại, độ tuổi và trạng thái chiếu. Từ khóa được giữ lại khi khách hàng điều hướng sang trang chi tiết phim và quay lại. Từ trang chi tiết phim, khách hàng có thể chuyển sang xem lịch chiếu (UC05) để tiếp tục đặt vé.</w:t>
             </w:r>
           </w:p>
         </w:tc>
@@ -10138,7 +10140,7 @@
                 <w:sz w:val="24"/>
                 <w:szCs w:val="24"/>
               </w:rPr>
-              <w:t>2. Khách hàng có thể nhấn "Xem lịch chiếu" để chuyển sang UC05 với movieId tương ứng.</w:t>
+              <w:t>2. Khách hàng có thể nhấn "Đặt vé" để chuyển sang UC05 (Xem lịch chiếu) với movieId tương ứng.</w:t>
             </w:r>
           </w:p>
           <w:p>
@@ -10157,7 +10159,7 @@
                 <w:sz w:val="24"/>
                 <w:szCs w:val="24"/>
               </w:rPr>
-              <w:t>3. Khách hàng có thể nhấn "Trailer" để xem trailer trong modal popup (nếu phim có trailer).</w:t>
+              <w:t>3. Khách hàng có thể nhấn "Chi tiết" để chuyển sang UC04 xem thông tin đầy đủ của phim (tên, thời lượng, độ tuổi, thể loại, mô tả, trailer).</w:t>
             </w:r>
           </w:p>
         </w:tc>
@@ -10244,7 +10246,7 @@
                 <w:sz w:val="24"/>
                 <w:szCs w:val="24"/>
               </w:rPr>
-              <w:t>Khách hàng nhấn nút "Chi tiết" trên một movie card, hệ thống gửi GET /movie-detail?id={movieId}.</w:t>
+              <w:t>Khách hàng nhập từ khóa vào ô tìm kiếm trên header.jsp và nhấn nút "Tìm". Trình duyệt gửi GET /search?keyword={keyword} đến SearchController.</w:t>
             </w:r>
           </w:p>
         </w:tc>
@@ -10438,7 +10440,7 @@
                 <w:sz w:val="24"/>
                 <w:szCs w:val="24"/>
               </w:rPr>
-              <w:t>3.1.0</w:t>
+              <w:t>3.1.1</w:t>
             </w:r>
           </w:p>
         </w:tc>
@@ -10524,7 +10526,7 @@
                 <w:sz w:val="24"/>
                 <w:szCs w:val="24"/>
               </w:rPr>
-              <w:t>3.1.1</w:t>
+              <w:t>3.1.2</w:t>
             </w:r>
           </w:p>
         </w:tc>
@@ -10610,7 +10612,7 @@
                 <w:sz w:val="24"/>
                 <w:szCs w:val="24"/>
               </w:rPr>
-              <w:t>3.1.2</w:t>
+              <w:t>3.1.3</w:t>
             </w:r>
           </w:p>
         </w:tc>
@@ -10644,7 +10646,7 @@
                 <w:sz w:val="24"/>
                 <w:szCs w:val="24"/>
               </w:rPr>
-              <w:t>SearchController kiểm tra keyword: nếu hasKeywordParam = true nhưng keyword.trim() rỗng → set message lỗi, forward sang movies.jsp với danh sách rỗng. Use case kết thúc tại đây với thông báo yêu cầu nhập từ khóa.</w:t>
+              <w:t>SearchController kiểm tra tính hợp lệ của keyword: gọi isInvalidKeyword(keyword, hasKeywordParam). Nếu keyword rỗng hoặc không hợp lệ → thực hiện Alternative Flow A1. Nếu hợp lệ, tiếp tục bước 3.1.4.</w:t>
             </w:r>
           </w:p>
         </w:tc>
@@ -10696,7 +10698,7 @@
                 <w:sz w:val="24"/>
                 <w:szCs w:val="24"/>
               </w:rPr>
-              <w:t>3.1.3</w:t>
+              <w:t>3.1.4</w:t>
             </w:r>
           </w:p>
         </w:tc>
@@ -10782,7 +10784,7 @@
                 <w:sz w:val="24"/>
                 <w:szCs w:val="24"/>
               </w:rPr>
-              <w:t>3.1.4</w:t>
+              <w:t>3.1.5-3.1.6</w:t>
             </w:r>
           </w:p>
         </w:tc>
@@ -10816,7 +10818,7 @@
                 <w:sz w:val="24"/>
                 <w:szCs w:val="24"/>
               </w:rPr>
-              <w:t>MovieService.normalizeKeyword(keyword): loại bỏ khoảng trắng thừa đầu/cuối, gom nhiều khoảng trắng thành một.</w:t>
+              <w:t>Bước 3.1.5: MovieService nhận yêu cầu searchMovies(keyword) từ SearchController và chuẩn bị xử lý nghiệp vụ tìm kiếm. Bước 3.1.6: MovieService.normalizeKeyword(keyword): loại bỏ khoảng trắng thừa đầu/cuối, gom nhiều khoảng trắng thành một.</w:t>
             </w:r>
           </w:p>
         </w:tc>
@@ -10868,7 +10870,7 @@
                 <w:sz w:val="24"/>
                 <w:szCs w:val="24"/>
               </w:rPr>
-              <w:t>3.1.5</w:t>
+              <w:t>3.1.7</w:t>
             </w:r>
           </w:p>
         </w:tc>
@@ -10902,7 +10904,7 @@
                 <w:sz w:val="24"/>
                 <w:szCs w:val="24"/>
               </w:rPr>
-              <w:t>MovieService gọi MovieDAO.findMoviesByKeyword(normalizedKeyword). MovieDAO thực thi SQL SELECT JOIN movies + movie_genres + genres, lọc WHERE LOWER(title) LIKE LOWER(:keyword) OR LOWER(genreNames) LIKE LOWER(:keyword), status IN (NOW_SHOWING, COMING_SOON).ription, m.poster_url, m.trailer_url, m.release_date, m.status, GROUP_CONCAT(g.name) AS genreNames FROM movies m LEFT JOIN movie_genres mg ON m.id = mg.movie_id LEFT JOIN genres g ON mg.genre_id = g.id WHERE m.id = :id GROUP BY m.id. Kết quả được ánh xạ thành đối tượng Movie thông qua JDBI BeanMapper.</w:t>
+              <w:t>MovieService gọi MovieDAO.findMoviesByKeyword(normalizedKeyword). MovieDAO thực thi SQL SELECT JOIN movies + movie_genres + genres, lọc WHERE LOWER(m.title) LIKE LOWER(:keyword) OR LOWER(COALESCE(gd.genreNames, '')) LIKE LOWER(:keyword), status IN (NOW_SHOWING, COMING_SOON). Kết quả được ánh xạ thành đối tượng Movie thông qua JDBI BeanMapper. Kết quả được sắp xếp ưu tiên: tiêu đề bắt đầu bằng keyword (ORDER BY 1), tiêu đề chứa keyword (ORDER BY 2), khớp thể loại (ORDER BY 3). MovieDAO trả danh sách Movie về MovieService.</w:t>
             </w:r>
           </w:p>
         </w:tc>
@@ -10954,7 +10956,7 @@
                 <w:sz w:val="24"/>
                 <w:szCs w:val="24"/>
               </w:rPr>
-              <w:t>3.1.6</w:t>
+              <w:t>3.1.8</w:t>
             </w:r>
           </w:p>
         </w:tc>
@@ -10988,7 +10990,7 @@
                 <w:sz w:val="24"/>
                 <w:szCs w:val="24"/>
               </w:rPr>
-              <w:t>Kết quả được sắp xếp ưu tiên: tiêu đề bắt đầu bằng keyword (1), tiêu đề chứa keyword (2), khớp thể loại (3). MovieDAO trả danh sách Movie về MovieService.</w:t>
+              <w:t>MovieService kiểm tra kết quả từ bước 3.1.7: Nếu danh sách kết quả không rỗng → tiếp tục bước 3.1.10. Nếu rỗng → thực hiện Alternative Flow A3 (tìm kiếm không dấu, bắt đầu từ bước 3.1.8 trong luồng A3).</w:t>
             </w:r>
           </w:p>
         </w:tc>
@@ -11040,7 +11042,7 @@
                 <w:sz w:val="24"/>
                 <w:szCs w:val="24"/>
               </w:rPr>
-              <w:t>3.1.7</w:t>
+              <w:t>3.1.10</w:t>
             </w:r>
           </w:p>
         </w:tc>
@@ -11074,7 +11076,7 @@
                 <w:sz w:val="24"/>
                 <w:szCs w:val="24"/>
               </w:rPr>
-              <w:t>Nếu danh sách kết quả không rỗng, MovieService trả danh sách về SearchController. Nếu rỗng → thực hiện Alternative Flow A3 (tìm không dấu).</w:t>
+              <w:t>MovieService trả List&lt;Movie&gt; về SearchController. SearchController set request.setAttribute("movies", movies) và setAttribute("keyword", keyword.trim()). Nếu movies rỗng: set thêm message và suggestedGenres (danh sách thể loại gợi ý).</w:t>
             </w:r>
           </w:p>
         </w:tc>
@@ -11126,7 +11128,7 @@
                 <w:sz w:val="24"/>
                 <w:szCs w:val="24"/>
               </w:rPr>
-              <w:t>3.1.8</w:t>
+              <w:t>3.1.11</w:t>
             </w:r>
           </w:p>
         </w:tc>
@@ -11160,7 +11162,7 @@
                 <w:sz w:val="24"/>
                 <w:szCs w:val="24"/>
               </w:rPr>
-              <w:t>SearchController set request.setAttribute("movies", movies) và setAttribute("keyword", keyword.trim()). Nếu movies rỗng: set thêm message và suggestedGenres (danh sách thể loại gợi ý).</w:t>
+              <w:t>SearchController forward sang /movies.jsp để hiển thị kết quả.</w:t>
             </w:r>
           </w:p>
         </w:tc>
@@ -11212,7 +11214,7 @@
                 <w:sz w:val="24"/>
                 <w:szCs w:val="24"/>
               </w:rPr>
-              <w:t>3.1.9</w:t>
+              <w:t>3.1.12</w:t>
             </w:r>
           </w:p>
         </w:tc>
@@ -11246,265 +11248,7 @@
                 <w:sz w:val="24"/>
                 <w:szCs w:val="24"/>
               </w:rPr>
-              <w:t>SearchController forward sang /movies.jsp để hiển thị kết quả.</w:t>
-            </w:r>
-          </w:p>
-        </w:tc>
-      </w:tr>
-      <w:tr>
-        <w:tblPrEx>
-          <w:tblBorders>
-            <w:top w:val="single" w:color="auto" w:sz="4" w:space="0"/>
-            <w:left w:val="single" w:color="auto" w:sz="4" w:space="0"/>
-            <w:bottom w:val="single" w:color="auto" w:sz="4" w:space="0"/>
-            <w:right w:val="single" w:color="auto" w:sz="4" w:space="0"/>
-            <w:insideH w:val="single" w:color="auto" w:sz="4" w:space="0"/>
-            <w:insideV w:val="single" w:color="auto" w:sz="4" w:space="0"/>
-          </w:tblBorders>
-          <w:tblCellMar>
-            <w:top w:w="0" w:type="dxa"/>
-            <w:left w:w="10" w:type="dxa"/>
-            <w:bottom w:w="0" w:type="dxa"/>
-            <w:right w:w="10" w:type="dxa"/>
-          </w:tblCellMar>
-        </w:tblPrEx>
-        <w:tc>
-          <w:tcPr>
-            <w:tcW w:w="1200" w:type="dxa"/>
-            <w:tcBorders>
-              <w:top w:val="single" w:color="000000" w:sz="6" w:space="0"/>
-              <w:left w:val="single" w:color="000000" w:sz="6" w:space="0"/>
-              <w:bottom w:val="single" w:color="000000" w:sz="6" w:space="0"/>
-              <w:right w:val="single" w:color="000000" w:sz="6" w:space="0"/>
-            </w:tcBorders>
-            <w:tcMar>
-              <w:top w:w="80" w:type="dxa"/>
-              <w:left w:w="120" w:type="dxa"/>
-              <w:bottom w:w="80" w:type="dxa"/>
-              <w:right w:w="120" w:type="dxa"/>
-            </w:tcMar>
-            <w:vAlign w:val="center"/>
-          </w:tcPr>
-          <w:p>
-            <w:pPr>
-              <w:spacing w:before="40" w:after="40" w:line="360" w:lineRule="auto"/>
-              <w:jc w:val="center"/>
-            </w:pPr>
-            <w:r>
-              <w:rPr>
-                <w:rFonts w:ascii="Times New Roman" w:hAnsi="Times New Roman" w:eastAsia="Times New Roman" w:cs="Times New Roman"/>
-                <w:b w:val="0"/>
-                <w:bCs w:val="0"/>
-                <w:sz w:val="24"/>
-                <w:szCs w:val="24"/>
-              </w:rPr>
-              <w:t>3.1.10</w:t>
-            </w:r>
-          </w:p>
-        </w:tc>
-        <w:tc>
-          <w:tcPr>
-            <w:tcW w:w="7826" w:type="dxa"/>
-            <w:tcBorders>
-              <w:top w:val="single" w:color="000000" w:sz="6" w:space="0"/>
-              <w:left w:val="single" w:color="000000" w:sz="6" w:space="0"/>
-              <w:bottom w:val="single" w:color="000000" w:sz="6" w:space="0"/>
-              <w:right w:val="single" w:color="000000" w:sz="6" w:space="0"/>
-            </w:tcBorders>
-            <w:tcMar>
-              <w:top w:w="80" w:type="dxa"/>
-              <w:left w:w="120" w:type="dxa"/>
-              <w:bottom w:w="80" w:type="dxa"/>
-              <w:right w:w="120" w:type="dxa"/>
-            </w:tcMar>
-            <w:vAlign w:val="center"/>
-          </w:tcPr>
-          <w:p>
-            <w:pPr>
-              <w:spacing w:before="40" w:after="40" w:line="360" w:lineRule="auto"/>
-              <w:jc w:val="left"/>
-            </w:pPr>
-            <w:r>
-              <w:rPr>
-                <w:rFonts w:ascii="Times New Roman" w:hAnsi="Times New Roman" w:eastAsia="Times New Roman" w:cs="Times New Roman"/>
-                <w:b w:val="0"/>
-                <w:bCs w:val="0"/>
-                <w:sz w:val="24"/>
-                <w:szCs w:val="24"/>
-              </w:rPr>
-              <w:t>movies.jsp hiển thị danh sách phim phù hợp với từ khóa: poster (hoặc placeholder), tên phim, thời lượng, độ tuổi, thể loại, trạng thái. Tiêu đề trang hiển thị: "Kết quả cho: {keyword}" và số lượng kết quả.</w:t>
-            </w:r>
-          </w:p>
-        </w:tc>
-      </w:tr>
-      <w:tr>
-        <w:tblPrEx>
-          <w:tblBorders>
-            <w:top w:val="single" w:color="auto" w:sz="4" w:space="0"/>
-            <w:left w:val="single" w:color="auto" w:sz="4" w:space="0"/>
-            <w:bottom w:val="single" w:color="auto" w:sz="4" w:space="0"/>
-            <w:right w:val="single" w:color="auto" w:sz="4" w:space="0"/>
-            <w:insideH w:val="single" w:color="auto" w:sz="4" w:space="0"/>
-            <w:insideV w:val="single" w:color="auto" w:sz="4" w:space="0"/>
-          </w:tblBorders>
-          <w:tblCellMar>
-            <w:top w:w="0" w:type="dxa"/>
-            <w:left w:w="10" w:type="dxa"/>
-            <w:bottom w:w="0" w:type="dxa"/>
-            <w:right w:w="10" w:type="dxa"/>
-          </w:tblCellMar>
-        </w:tblPrEx>
-        <w:tc>
-          <w:tcPr>
-            <w:tcW w:w="1200" w:type="dxa"/>
-            <w:tcBorders>
-              <w:top w:val="single" w:color="000000" w:sz="6" w:space="0"/>
-              <w:left w:val="single" w:color="000000" w:sz="6" w:space="0"/>
-              <w:bottom w:val="single" w:color="000000" w:sz="6" w:space="0"/>
-              <w:right w:val="single" w:color="000000" w:sz="6" w:space="0"/>
-            </w:tcBorders>
-            <w:tcMar>
-              <w:top w:w="80" w:type="dxa"/>
-              <w:left w:w="120" w:type="dxa"/>
-              <w:bottom w:w="80" w:type="dxa"/>
-              <w:right w:w="120" w:type="dxa"/>
-            </w:tcMar>
-            <w:vAlign w:val="center"/>
-          </w:tcPr>
-          <w:p>
-            <w:pPr>
-              <w:spacing w:before="40" w:after="40" w:line="360" w:lineRule="auto"/>
-              <w:jc w:val="center"/>
-            </w:pPr>
-            <w:r>
-              <w:rPr>
-                <w:rFonts w:ascii="Times New Roman" w:hAnsi="Times New Roman" w:eastAsia="Times New Roman" w:cs="Times New Roman"/>
-                <w:b w:val="0"/>
-                <w:bCs w:val="0"/>
-                <w:sz w:val="24"/>
-                <w:szCs w:val="24"/>
-              </w:rPr>
-              <w:t>3.1.11</w:t>
-            </w:r>
-          </w:p>
-        </w:tc>
-        <w:tc>
-          <w:tcPr>
-            <w:tcW w:w="7826" w:type="dxa"/>
-            <w:tcBorders>
-              <w:top w:val="single" w:color="000000" w:sz="6" w:space="0"/>
-              <w:left w:val="single" w:color="000000" w:sz="6" w:space="0"/>
-              <w:bottom w:val="single" w:color="000000" w:sz="6" w:space="0"/>
-              <w:right w:val="single" w:color="000000" w:sz="6" w:space="0"/>
-            </w:tcBorders>
-            <w:tcMar>
-              <w:top w:w="80" w:type="dxa"/>
-              <w:left w:w="120" w:type="dxa"/>
-              <w:bottom w:w="80" w:type="dxa"/>
-              <w:right w:w="120" w:type="dxa"/>
-            </w:tcMar>
-            <w:vAlign w:val="center"/>
-          </w:tcPr>
-          <w:p>
-            <w:pPr>
-              <w:spacing w:before="40" w:after="40" w:line="360" w:lineRule="auto"/>
-              <w:jc w:val="left"/>
-            </w:pPr>
-            <w:r>
-              <w:rPr>
-                <w:rFonts w:ascii="Times New Roman" w:hAnsi="Times New Roman" w:eastAsia="Times New Roman" w:cs="Times New Roman"/>
-                <w:b w:val="0"/>
-                <w:bCs w:val="0"/>
-                <w:sz w:val="24"/>
-                <w:szCs w:val="24"/>
-              </w:rPr>
-              <w:t>Các bộ lọc (thể loại, độ tuổi, trạng thái) được populate tự động từ data-genre, data-rating, data-status của movie card. Khách hàng có thể lọc thêm phía client mà không cần request mới lên server.</w:t>
-            </w:r>
-          </w:p>
-        </w:tc>
-      </w:tr>
-      <w:tr>
-        <w:tblPrEx>
-          <w:tblBorders>
-            <w:top w:val="single" w:color="auto" w:sz="4" w:space="0"/>
-            <w:left w:val="single" w:color="auto" w:sz="4" w:space="0"/>
-            <w:bottom w:val="single" w:color="auto" w:sz="4" w:space="0"/>
-            <w:right w:val="single" w:color="auto" w:sz="4" w:space="0"/>
-            <w:insideH w:val="single" w:color="auto" w:sz="4" w:space="0"/>
-            <w:insideV w:val="single" w:color="auto" w:sz="4" w:space="0"/>
-          </w:tblBorders>
-          <w:tblCellMar>
-            <w:top w:w="0" w:type="dxa"/>
-            <w:left w:w="10" w:type="dxa"/>
-            <w:bottom w:w="0" w:type="dxa"/>
-            <w:right w:w="10" w:type="dxa"/>
-          </w:tblCellMar>
-        </w:tblPrEx>
-        <w:tc>
-          <w:tcPr>
-            <w:tcW w:w="1200" w:type="dxa"/>
-            <w:tcBorders>
-              <w:top w:val="single" w:color="000000" w:sz="6" w:space="0"/>
-              <w:left w:val="single" w:color="000000" w:sz="6" w:space="0"/>
-              <w:bottom w:val="single" w:color="000000" w:sz="6" w:space="0"/>
-              <w:right w:val="single" w:color="000000" w:sz="6" w:space="0"/>
-            </w:tcBorders>
-            <w:tcMar>
-              <w:top w:w="80" w:type="dxa"/>
-              <w:left w:w="120" w:type="dxa"/>
-              <w:bottom w:w="80" w:type="dxa"/>
-              <w:right w:w="120" w:type="dxa"/>
-            </w:tcMar>
-            <w:vAlign w:val="center"/>
-          </w:tcPr>
-          <w:p>
-            <w:pPr>
-              <w:spacing w:before="40" w:after="40" w:line="360" w:lineRule="auto"/>
-              <w:jc w:val="center"/>
-            </w:pPr>
-            <w:r>
-              <w:rPr>
-                <w:rFonts w:ascii="Times New Roman" w:hAnsi="Times New Roman" w:eastAsia="Times New Roman" w:cs="Times New Roman"/>
-                <w:b w:val="0"/>
-                <w:bCs w:val="0"/>
-                <w:sz w:val="24"/>
-                <w:szCs w:val="24"/>
-              </w:rPr>
-              <w:t>3.1.12</w:t>
-            </w:r>
-          </w:p>
-        </w:tc>
-        <w:tc>
-          <w:tcPr>
-            <w:tcW w:w="7826" w:type="dxa"/>
-            <w:tcBorders>
-              <w:top w:val="single" w:color="000000" w:sz="6" w:space="0"/>
-              <w:left w:val="single" w:color="000000" w:sz="6" w:space="0"/>
-              <w:bottom w:val="single" w:color="000000" w:sz="6" w:space="0"/>
-              <w:right w:val="single" w:color="000000" w:sz="6" w:space="0"/>
-            </w:tcBorders>
-            <w:tcMar>
-              <w:top w:w="80" w:type="dxa"/>
-              <w:left w:w="120" w:type="dxa"/>
-              <w:bottom w:w="80" w:type="dxa"/>
-              <w:right w:w="120" w:type="dxa"/>
-            </w:tcMar>
-            <w:vAlign w:val="center"/>
-          </w:tcPr>
-          <w:p>
-            <w:pPr>
-              <w:spacing w:before="40" w:after="40" w:line="360" w:lineRule="auto"/>
-              <w:jc w:val="left"/>
-            </w:pPr>
-            <w:r>
-              <w:rPr>
-                <w:rFonts w:ascii="Times New Roman" w:hAnsi="Times New Roman" w:eastAsia="Times New Roman" w:cs="Times New Roman"/>
-                <w:b w:val="0"/>
-                <w:bCs w:val="0"/>
-                <w:sz w:val="24"/>
-                <w:szCs w:val="24"/>
-              </w:rPr>
-              <w:t>Bộ đếm "Có X phim được hiển thị." cập nhật theo bộ lọc. Use case UC03 kết thúc. Khách hàng có thể nhấn "Chi tiết" để chuyển sang UC04, hoặc "Đặt vé" để chuyển sang UC06.</w:t>
+              <w:t>movies.jsp hiển thị danh sách phim phù hợp với từ khóa: poster (hoặc placeholder), tên phim, thời lượng, độ tuổi, thể loại, trạng thái. Tiêu đề trang hiển thị: "Kết quả cho: {keyword}" và số lượng kết quả. Các bộ lọc (thể loại, độ tuổi, trạng thái) được populate tự động từ data-genre, data-rating, data-status của movie card. Khách hàng có thể lọc thêm phía client mà không cần request mới lên server. Bộ đếm "Có X phim được hiển thị." cập nhật theo bộ lọc. Use case UC03 kết thúc. Khách hàng có thể nhấn "Chi tiết" để chuyển sang UC04, hoặc "Đặt vé" để chuyển sang UC05 (Xem lịch chiếu).</w:t>
             </w:r>
           </w:p>
         </w:tc>
@@ -11874,7 +11618,7 @@
                 <w:sz w:val="24"/>
                 <w:szCs w:val="24"/>
               </w:rPr>
-              <w:t>3.1.1</w:t>
+              <w:t>3.1.3</w:t>
             </w:r>
           </w:p>
         </w:tc>
@@ -11942,7 +11686,7 @@
                 <w:sz w:val="24"/>
                 <w:szCs w:val="24"/>
               </w:rPr>
-              <w:t>SearchController set message: "Vui lòng nhập từ khóa tìm kiếm phim.", set movies = rỗng. Forward sang movies.jsp. Không gọi MovieService.ấn.</w:t>
+              <w:t>SearchController set message: "Vui lòng nhập từ khóa tìm kiếm phim.", set movies = rỗng. Forward sang movies.jsp. Không gọi MovieService.</w:t>
             </w:r>
           </w:p>
         </w:tc>
@@ -12130,7 +11874,7 @@
                 <w:sz w:val="24"/>
                 <w:szCs w:val="24"/>
               </w:rPr>
-              <w:t>Integer.parseInt("abc") phát sinh NumberFormatException. Controller redirect về /movies.</w:t>
+              <w:t>SearchController nhận request với !hasKeywordParam (không có tham số keyword trong URL). Hệ thống gọi MovieService.getNowShowingMovies(). MovieDAO thực thi SELECT WHERE status='NOW_SHOWING', trả List&lt;Movie&gt;. setAttribute("movies", movies) và setAttribute("keyword", ""). Forward sang movies.jsp hiển thị danh sách phim đang chiếu.</w:t>
             </w:r>
           </w:p>
         </w:tc>
@@ -12250,7 +11994,7 @@
                 <w:sz w:val="24"/>
                 <w:szCs w:val="24"/>
               </w:rPr>
-              <w:t>3.1.7</w:t>
+              <w:t>3.1.8</w:t>
             </w:r>
           </w:p>
         </w:tc>
@@ -12438,7 +12182,7 @@
                 <w:sz w:val="24"/>
                 <w:szCs w:val="24"/>
               </w:rPr>
-              <w:t>3.1.9</w:t>
+              <w:t>3.1.10</w:t>
             </w:r>
           </w:p>
         </w:tc>
@@ -12626,7 +12370,7 @@
                 <w:sz w:val="24"/>
                 <w:szCs w:val="24"/>
               </w:rPr>
-              <w:t>3.1.10</w:t>
+              <w:t>3.1.12</w:t>
             </w:r>
           </w:p>
         </w:tc>
@@ -12694,7 +12438,7 @@
                 <w:sz w:val="24"/>
                 <w:szCs w:val="24"/>
               </w:rPr>
-              <w:t>movie-detail.jsp sử dụng &lt;c:if test="${not empty movie.trailerUrl}"&gt; nên nút "Trailer" bị ẩn hoàn toàn. Các thông tin khác vẫn hiển thị bình thường.</w:t>
+              <w:t>JavaScript filterMovies() chạy khi khách hàng thay đổi dropdown Thể loại, Độ tuổi hoặc Trạng thái. Hàm duyệt từng movie card, kiểm tra data-genre, data-rating, data-status. Card không thỏa điều kiện bị ẩn (display:none). Bộ đếm "Có X phim được hiển thị." cập nhật ngay. Không gửi request mới lên server.</w:t>
             </w:r>
           </w:p>
         </w:tc>
@@ -12814,7 +12558,7 @@
                 <w:sz w:val="24"/>
                 <w:szCs w:val="24"/>
               </w:rPr>
-              <w:t>3.1.9</w:t>
+              <w:t>3.1.12</w:t>
             </w:r>
           </w:p>
         </w:tc>
@@ -12848,7 +12592,7 @@
                 <w:sz w:val="24"/>
                 <w:szCs w:val="24"/>
               </w:rPr>
-              <w:t>Khách hàng nhấn "Chi tiết" từ kết quả tìm kiếm.</w:t>
+              <w:t>Khách hàng chọn đồng thời nhiều bộ lọc (Thể loại AND Độ tuổi AND Trạng thái) trên trang movies.jsp sau khi kết quả tìm kiếm đã được hiển thị, dẫn đến không có phim nào thỏa mãn đồng thời tất cả điều kiện.</w:t>
             </w:r>
           </w:p>
         </w:tc>
@@ -12882,7 +12626,7 @@
                 <w:sz w:val="24"/>
                 <w:szCs w:val="24"/>
               </w:rPr>
-              <w:t>Câu truy vấn sử dụng COALESCE nên genreNames được trả về là "Chưa phân loại". Trang vẫn hiển thị bình thường.</w:t>
+              <w:t>JavaScript filterMovies() kiểm tra từng movie card theo cả 3 điều kiện đồng thời (thể loại AND độ tuổi AND trạng thái). Không có card nào thỏa mãn, tất cả bị ẩn. Bộ đếm hiển thị "Có 0 phim được hiển thị.". Thông báo "Không có phim phù hợp với bộ lọc đang chọn." xuất hiện.</w:t>
             </w:r>
           </w:p>
         </w:tc>
@@ -12931,10 +12675,15 @@
           <w:sz w:val="24"/>
           <w:szCs w:val="24"/>
         </w:rPr>
-        <w:t>Sequence Diagram dưới đây mô tả trình tự tương tác giữa các thành phần trong hệ thống khi khách hàng thực hiện chức năng tìm kiếm phim (UC03). Các thành phần tham gia gồm: Khách hàng (Browser), SearchController, MovieService, MovieDAO và Database (MySQL). xem chi tiết phim (UC04). Các thành phần tham gia gồm: Khách hàng (Browser), MovieController, MovieService, MovieDAO và Database (MySQL).</w:t>
+        <w:t>Sequence Diagram dưới đây mô tả trình tự tương tác giữa các thành phần trong hệ thống khi khách hàng thực hiện chức năng tìm kiếm phim (UC03). Các thành phần tham gia gồm: Khách hàng (Browser), SearchController, MovieService, MovieDAO và Database (MySQL).</w:t>
       </w:r>
     </w:p>
     <w:p>
+      <w:r>
+        <w:br w:type="page"/>
+      </w:r>
+    </w:p>
+    <w:p>
       <w:pPr>
         <w:spacing w:before="0" w:after="0" w:line="360" w:lineRule="auto"/>
       </w:pPr>
@@ -12944,16 +12693,11 @@
         <w:spacing w:before="0" w:after="0" w:line="360" w:lineRule="auto"/>
       </w:pPr>
       <w:r>
-        <w:rPr>
-          <w:rFonts w:ascii="Arial" w:hAnsi="Arial"/>
-          <w:sz w:val="24"/>
-          <w:lang w:val="en-US"/>
-        </w:rPr>
         <w:drawing>
           <wp:inline distT="0" distB="0" distL="114300" distR="114300">
-            <wp:extent cx="5539740" cy="2424430"/>
-            <wp:effectExtent l="0" t="0" r="7620" b="13970"/>
-            <wp:docPr id="2" name="Picture 2" descr="Movie Search Keyword Flow-2026-05-10-150038"/>
+            <wp:extent cx="5752465" cy="2937510"/>
+            <wp:effectExtent l="0" t="0" r="8255" b="3810"/>
+            <wp:docPr id="3" name="Picture 1"/>
             <wp:cNvGraphicFramePr>
               <a:graphicFrameLocks xmlns:a="http://schemas.openxmlformats.org/drawingml/2006/main" noChangeAspect="1"/>
             </wp:cNvGraphicFramePr>
@@ -12961,7 +12705,7 @@
               <a:graphicData uri="http://schemas.openxmlformats.org/drawingml/2006/picture">
                 <pic:pic xmlns:pic="http://schemas.openxmlformats.org/drawingml/2006/picture">
                   <pic:nvPicPr>
-                    <pic:cNvPr id="2" name="Picture 2" descr="Movie Search Keyword Flow-2026-05-10-150038"/>
+                    <pic:cNvPr id="3" name="Picture 1"/>
                     <pic:cNvPicPr>
                       <a:picLocks noChangeAspect="1"/>
                     </pic:cNvPicPr>
@@ -12975,11 +12719,15 @@
                   <pic:spPr>
                     <a:xfrm>
                       <a:off x="0" y="0"/>
-                      <a:ext cx="5539740" cy="2424430"/>
+                      <a:ext cx="5752465" cy="2937510"/>
                     </a:xfrm>
                     <a:prstGeom prst="rect">
                       <a:avLst/>
                     </a:prstGeom>
+                    <a:noFill/>
+                    <a:ln>
+                      <a:noFill/>
+                    </a:ln>
                   </pic:spPr>
                 </pic:pic>
               </a:graphicData>
@@ -12987,8 +12735,97 @@
           </wp:inline>
         </w:drawing>
       </w:r>
-      <w:bookmarkStart w:id="57" w:name="_GoBack"/>
-      <w:bookmarkEnd w:id="57"/>
+    </w:p>
+    <w:p>
+      <w:pPr>
+        <w:spacing w:before="0" w:after="0" w:line="360" w:lineRule="auto"/>
+      </w:pPr>
+      <w:r>
+        <w:drawing>
+          <wp:inline distT="0" distB="0" distL="114300" distR="114300">
+            <wp:extent cx="5746750" cy="3837940"/>
+            <wp:effectExtent l="0" t="0" r="13970" b="2540"/>
+            <wp:docPr id="5" name="Picture 2"/>
+            <wp:cNvGraphicFramePr>
+              <a:graphicFrameLocks xmlns:a="http://schemas.openxmlformats.org/drawingml/2006/main" noChangeAspect="1"/>
+            </wp:cNvGraphicFramePr>
+            <a:graphic xmlns:a="http://schemas.openxmlformats.org/drawingml/2006/main">
+              <a:graphicData uri="http://schemas.openxmlformats.org/drawingml/2006/picture">
+                <pic:pic xmlns:pic="http://schemas.openxmlformats.org/drawingml/2006/picture">
+                  <pic:nvPicPr>
+                    <pic:cNvPr id="5" name="Picture 2"/>
+                    <pic:cNvPicPr>
+                      <a:picLocks noChangeAspect="1"/>
+                    </pic:cNvPicPr>
+                  </pic:nvPicPr>
+                  <pic:blipFill>
+                    <a:blip r:embed="rId12"/>
+                    <a:stretch>
+                      <a:fillRect/>
+                    </a:stretch>
+                  </pic:blipFill>
+                  <pic:spPr>
+                    <a:xfrm>
+                      <a:off x="0" y="0"/>
+                      <a:ext cx="5746750" cy="3837940"/>
+                    </a:xfrm>
+                    <a:prstGeom prst="rect">
+                      <a:avLst/>
+                    </a:prstGeom>
+                    <a:noFill/>
+                    <a:ln>
+                      <a:noFill/>
+                    </a:ln>
+                  </pic:spPr>
+                </pic:pic>
+              </a:graphicData>
+            </a:graphic>
+          </wp:inline>
+        </w:drawing>
+      </w:r>
+      <w:r>
+        <w:drawing>
+          <wp:inline distT="0" distB="0" distL="114300" distR="114300">
+            <wp:extent cx="5751195" cy="1363345"/>
+            <wp:effectExtent l="0" t="0" r="9525" b="8255"/>
+            <wp:docPr id="6" name="Picture 3"/>
+            <wp:cNvGraphicFramePr>
+              <a:graphicFrameLocks xmlns:a="http://schemas.openxmlformats.org/drawingml/2006/main" noChangeAspect="1"/>
+            </wp:cNvGraphicFramePr>
+            <a:graphic xmlns:a="http://schemas.openxmlformats.org/drawingml/2006/main">
+              <a:graphicData uri="http://schemas.openxmlformats.org/drawingml/2006/picture">
+                <pic:pic xmlns:pic="http://schemas.openxmlformats.org/drawingml/2006/picture">
+                  <pic:nvPicPr>
+                    <pic:cNvPr id="6" name="Picture 3"/>
+                    <pic:cNvPicPr>
+                      <a:picLocks noChangeAspect="1"/>
+                    </pic:cNvPicPr>
+                  </pic:nvPicPr>
+                  <pic:blipFill>
+                    <a:blip r:embed="rId13"/>
+                    <a:stretch>
+                      <a:fillRect/>
+                    </a:stretch>
+                  </pic:blipFill>
+                  <pic:spPr>
+                    <a:xfrm>
+                      <a:off x="0" y="0"/>
+                      <a:ext cx="5751195" cy="1363345"/>
+                    </a:xfrm>
+                    <a:prstGeom prst="rect">
+                      <a:avLst/>
+                    </a:prstGeom>
+                    <a:noFill/>
+                    <a:ln>
+                      <a:noFill/>
+                    </a:ln>
+                  </pic:spPr>
+                </pic:pic>
+              </a:graphicData>
+            </a:graphic>
+          </wp:inline>
+        </w:drawing>
+      </w:r>
     </w:p>
     <w:p>
       <w:pPr>
@@ -13316,7 +13153,7 @@
           <w:sz w:val="24"/>
           <w:szCs w:val="24"/>
         </w:rPr>
-        <w:t>Các test case dưới đây được thiết kế để kiểm thử chức năng UC03 – Tìm kiếm phim, bao gồm các kịch bản thành công, keyword không hợp lệ, tìm kiếm không dấu, lọc phía client và giữ từ khóa khi điều hướng. Tất cả test case được đối chiếu với mã nguồn SearchController, MovieService, MovieDAO và movies.jsp. lý lỗi đầu vào và các trường hợp dữ liệu đặc biệt. Tất cả test case được đối chiếu trực tiếp với mã nguồn SearchController, MovieService, MovieDAO và movies.jsp.</w:t>
+        <w:t>Các test case dưới đây được thiết kế để kiểm thử chức năng UC03 – Tìm kiếm phim, bao gồm các kịch bản thành công, keyword không hợp lệ, tìm kiếm không dấu, lọc phía client và giữ từ khóa khi điều hướng. Tất cả test case được đối chiếu với mã nguồn SearchController, MovieService, MovieDAO và movies.jsp.</w:t>
       </w:r>
     </w:p>
     <w:p>
@@ -14017,7 +13854,7 @@
                 <w:sz w:val="24"/>
                 <w:szCs w:val="24"/>
               </w:rPr>
-              <w:t>5. Nút "Trailer" hiển thị (vì phim có trailerUrl).</w:t>
+              <w:t>5. Nút "Chi tiết" hiển thị và điều hướng sang /movie-detail?id={id}&amp;keyword={keyword}.</w:t>
             </w:r>
           </w:p>
           <w:p>
@@ -14036,7 +13873,7 @@
                 <w:sz w:val="24"/>
                 <w:szCs w:val="24"/>
               </w:rPr>
-              <w:t>6. Nút "Xem lịch chiếu" và "Quay lại" hiển thị và hoạt động.</w:t>
+              <w:t>6. Nút "Đặt vé" hiển thị (phim NOW_SHOWING) hoặc nút "Sắp chiếu" bị disabled (phim COMING_SOON). Không có nút "Xem lịch chiếu" hay "Quay lại" trên trang movies.jsp.</w:t>
             </w:r>
           </w:p>
         </w:tc>
@@ -14479,7 +14316,7 @@
                 <w:sz w:val="24"/>
                 <w:szCs w:val="24"/>
               </w:rPr>
-              <w:t>2. MovieController kiểm tra id = "9999" hợp lệ về dạng số.</w:t>
+              <w:t>2. SearchController nhận request, gọi isInvalidKeyword("", true) → trả về true (invalidKeyword = true).</w:t>
             </w:r>
           </w:p>
           <w:p>
@@ -15094,7 +14931,7 @@
                 <w:sz w:val="24"/>
                 <w:szCs w:val="24"/>
               </w:rPr>
-              <w:t>1. Mở trình duyệt, truy cập URL: /search?keyword=avengers.</w:t>
+              <w:t>1. Mở trình duyệt, truy cập URL: /search?keyword=H%C3%A0nh+%C4%90%E1%BB%99ng.</w:t>
             </w:r>
           </w:p>
           <w:p>
@@ -15113,7 +14950,7 @@
                 <w:sz w:val="24"/>
                 <w:szCs w:val="24"/>
               </w:rPr>
-              <w:t>2. MovieController nhận request, gọi request.getParameter("id").</w:t>
+              <w:t>2. SearchController nhận request, gọi isInvalidKeyword("Hành Động", true) → false (keyword hợp lệ).</w:t>
             </w:r>
           </w:p>
           <w:p>
@@ -15132,7 +14969,7 @@
                 <w:sz w:val="24"/>
                 <w:szCs w:val="24"/>
               </w:rPr>
-              <w:t>3. MovieService.normalizeKeyword("avengers") → "avengers". Gọi MovieDAO.findMoviesByKeyword("avengers").</w:t>
+              <w:t>3. MovieService.normalizeKeyword("Hành Động") → "Hành Động". Gọi MovieDAO.findMoviesByKeyword("Hành Động").</w:t>
             </w:r>
           </w:p>
           <w:p>
@@ -15151,7 +14988,7 @@
                 <w:sz w:val="24"/>
                 <w:szCs w:val="24"/>
               </w:rPr>
-              <w:t>4. MovieDAO thực thi SQL với LOWER(title) LIKE LOWER("%avengers%"), trả về danh sách phim.</w:t>
+              <w:t>4. MovieDAO thực thi SQL với LOWER(genreNames) LIKE LOWER("%Hành Động%"), trả về danh sách phim có thể loại khớp.</w:t>
             </w:r>
           </w:p>
         </w:tc>
@@ -15260,7 +15097,7 @@
                 <w:sz w:val="24"/>
                 <w:szCs w:val="24"/>
               </w:rPr>
-              <w:t>2. Phim "Avengers: Endgame" xuất hiện trong kết quả.</w:t>
+              <w:t>2. Phim có thể loại “Hành Động” xuất hiện trong kết quả tìm kiếm.</w:t>
             </w:r>
           </w:p>
           <w:p>
@@ -15279,7 +15116,7 @@
                 <w:sz w:val="24"/>
                 <w:szCs w:val="24"/>
               </w:rPr>
-              <w:t>3. Kết quả được sắp xếp đúng theo độ ưu tiên (tiêu đề bắt đầu bằng "avengers" trước).</w:t>
+              <w:t>3. Kết quả được sắp xếp đúng theo độ ưu tiên (khớp tên trước, khớp thể loại sau).</w:t>
             </w:r>
           </w:p>
         </w:tc>
@@ -15703,7 +15540,7 @@
                 <w:sz w:val="24"/>
                 <w:szCs w:val="24"/>
               </w:rPr>
-              <w:t>2. MovieController nhận idRaw = "abc".</w:t>
+              <w:t>2. SearchController gọi MovieService.searchMovies("dat rung phuong nam"). MovieService.normalizeKeyword() chuẩn hóa keyword.</w:t>
             </w:r>
           </w:p>
           <w:p>
@@ -15722,7 +15559,7 @@
                 <w:sz w:val="24"/>
                 <w:szCs w:val="24"/>
               </w:rPr>
-              <w:t>3. Controller thực hiện Integer.parseInt("abc"), phát sinh NumberFormatException.</w:t>
+              <w:t>3. MovieDAO.findMoviesByKeyword() trả về rỗng. MovieService gọi stripAccents() → lowerNorm, gọi findAllForSearch(), lọc phim có title/genre chứa lowerNorm sau khi bỏ dấu. Sắp xếp: startsWith=0, contains=1, else=2.</w:t>
             </w:r>
           </w:p>
         </w:tc>
@@ -15831,7 +15668,7 @@
                 <w:sz w:val="24"/>
                 <w:szCs w:val="24"/>
               </w:rPr>
-              <w:t>2. Thông báo lỗi "Vui lòng nhập từ khóa tìm kiếm phim." được hiển thị.</w:t>
+              <w:t>2. Phim "Đất Rừng Phương Nam" (hoặc phim có title tương ứng) xuất hiện trong kết quả tìm kiếm.</w:t>
             </w:r>
           </w:p>
           <w:p>
@@ -15850,7 +15687,7 @@
                 <w:sz w:val="24"/>
                 <w:szCs w:val="24"/>
               </w:rPr>
-              <w:t>3. Không có lỗi 500. Kết quả được sắp xếp đúng theo độ ưu tiên.</w:t>
+              <w:t>3. Không có lỗi HTTP 500. Kết quả được sắp xếp đúng theo độ ưu tiên: startsWith → 0, contains → 1, else → 2.</w:t>
             </w:r>
           </w:p>
         </w:tc>
@@ -16331,7 +16168,7 @@
                 <w:sz w:val="24"/>
                 <w:szCs w:val="24"/>
               </w:rPr>
-              <w:t>4. JSP kiểm tra: &lt;c:if test="${not empty movie.trailerUrl}"&gt;.</w:t>
+              <w:t>4. SearchController set message = "Không tìm thấy phim phù hợp với từ khóa: \"xyzabc\"" và gọi MovieService.getAllGenres() để lấy danh sách suggestedGenres, rồi forward sang movies.jsp.</w:t>
             </w:r>
           </w:p>
         </w:tc>
@@ -16440,7 +16277,7 @@
                 <w:sz w:val="24"/>
                 <w:szCs w:val="24"/>
               </w:rPr>
-              <w:t>2. Nút "Trailer" bị ẩn hoàn toàn (không render ra HTML).</w:t>
+              <w:t>2. Thông báo "Không tìm thấy phim phù hợp với từ khóa: "xyzabc"" được hiển thị.</w:t>
             </w:r>
           </w:p>
           <w:p>
@@ -16478,7 +16315,7 @@
                 <w:sz w:val="24"/>
                 <w:szCs w:val="24"/>
               </w:rPr>
-              <w:t>4. Nút "Xem lịch chiếu" và "Quay lại" vẫn hoạt động.</w:t>
+              <w:t>4. Danh sách phim trống; bộ đếm hiển thị “Có 0 phim được hiển thị.”</w:t>
             </w:r>
           </w:p>
         </w:tc>
@@ -16921,7 +16758,7 @@
                 <w:sz w:val="24"/>
                 <w:szCs w:val="24"/>
               </w:rPr>
-              <w:t>2. JSP kiểm tra: &lt;c:choose&gt; → &lt;c:when test="${not empty movie.posterUrl}"&gt; thất bại.</w:t>
+              <w:t>2. JavaScript filterMovies() chạy khi dropdown Thể loại đổi sang "Hành động". Hàm kiểm tra data-genre của từng movie card.</w:t>
             </w:r>
           </w:p>
           <w:p>
@@ -16940,7 +16777,7 @@
                 <w:sz w:val="24"/>
                 <w:szCs w:val="24"/>
               </w:rPr>
-              <w:t>3. JavaScript filterMovies() chạy, kiểm tra data-genre của từng movie card.</w:t>
+              <w:t>3. Các movie card không chứa “Hành động” trong data-genre bị ẩn (class “hidden”). Bộ đếm “Có X phim được hiển thị.” cập nhật.</w:t>
             </w:r>
           </w:p>
         </w:tc>
@@ -17712,9 +17549,9 @@
           <w:rFonts w:ascii="Arial" w:hAnsi="Arial"/>
         </w:rPr>
       </w:pPr>
-      <w:bookmarkStart w:id="43" w:name="_Toc9810"/>
-      <w:bookmarkStart w:id="44" w:name="_Toc7416"/>
-      <w:bookmarkStart w:id="45" w:name="_Toc228887530"/>
+      <w:bookmarkStart w:id="43" w:name="_Toc7416"/>
+      <w:bookmarkStart w:id="44" w:name="_Toc228887530"/>
+      <w:bookmarkStart w:id="45" w:name="_Toc9810"/>
       <w:r>
         <w:rPr>
           <w:rFonts w:ascii="Arial" w:hAnsi="Arial"/>
@@ -17764,7 +17601,7 @@
                     </pic:cNvPicPr>
                   </pic:nvPicPr>
                   <pic:blipFill>
-                    <a:blip r:embed="rId12"/>
+                    <a:blip r:embed="rId14"/>
                     <a:stretch>
                       <a:fillRect/>
                     </a:stretch>
@@ -17881,7 +17718,7 @@
                     </pic:cNvPicPr>
                   </pic:nvPicPr>
                   <pic:blipFill>
-                    <a:blip r:embed="rId13" cstate="print">
+                    <a:blip r:embed="rId15" cstate="print">
                       <a:extLst>
                         <a:ext uri="{28A0092B-C50C-407E-A947-70E740481C1C}">
                           <a14:useLocalDpi xmlns:a14="http://schemas.microsoft.com/office/drawing/2010/main" val="0"/>
@@ -18043,7 +17880,7 @@
                     </pic:cNvPicPr>
                   </pic:nvPicPr>
                   <pic:blipFill>
-                    <a:blip r:embed="rId14" cstate="print">
+                    <a:blip r:embed="rId16" cstate="print">
                       <a:extLst>
                         <a:ext uri="{28A0092B-C50C-407E-A947-70E740481C1C}">
                           <a14:useLocalDpi xmlns:a14="http://schemas.microsoft.com/office/drawing/2010/main" val="0"/>
@@ -18209,7 +18046,7 @@
                     </pic:cNvPicPr>
                   </pic:nvPicPr>
                   <pic:blipFill>
-                    <a:blip r:embed="rId15" cstate="print">
+                    <a:blip r:embed="rId17" cstate="print">
                       <a:extLst>
                         <a:ext uri="{28A0092B-C50C-407E-A947-70E740481C1C}">
                           <a14:useLocalDpi xmlns:a14="http://schemas.microsoft.com/office/drawing/2010/main" val="0"/>
@@ -18333,34 +18170,7 @@
           <w:sz w:val="24"/>
           <w:szCs w:val="24"/>
         </w:rPr>
-        <w:t>Trang tìm kiếm hiển thị danh sách phim phù hợp với từ khóa. Mỗi phim hiển thị poster (hoặc placeholder), tên, thời lượng, độ tuổi, thể loại và trạng thái. Hỗ trợ lọc phía client theo thể loại, độ tuổi và trạng thái chiếu. Khi không có kết quả, hiển thị gợi ý thể loại phổ biến.gắn, nội dung phim. Có nút "Trailer", "Xem lịch chiếu" và "Quay lại</w:t>
-      </w:r>
-      <w:r>
-        <w:rPr>
-          <w:rFonts w:hint="default" w:cs="Times New Roman"/>
-          <w:b w:val="0"/>
-          <w:bCs w:val="0"/>
-          <w:i w:val="0"/>
-          <w:iCs w:val="0"/>
-          <w:color w:val="000000"/>
-          <w:sz w:val="24"/>
-          <w:szCs w:val="24"/>
-          <w:lang w:val="en-US"/>
-        </w:rPr>
-        <w:t xml:space="preserve"> danh sách</w:t>
-      </w:r>
-      <w:r>
-        <w:rPr>
-          <w:rFonts w:ascii="Times New Roman" w:hAnsi="Times New Roman" w:eastAsia="Times New Roman" w:cs="Times New Roman"/>
-          <w:b w:val="0"/>
-          <w:bCs w:val="0"/>
-          <w:i w:val="0"/>
-          <w:iCs w:val="0"/>
-          <w:color w:val="000000"/>
-          <w:sz w:val="24"/>
-          <w:szCs w:val="24"/>
-        </w:rPr>
-        <w:t>".</w:t>
+        <w:t>Trang tìm kiếm hiển thị danh sách phim phù hợp với từ khóa. Mỗi phim hiển thị poster (hoặc placeholder), tên, thời lượng, độ tuổi, thể loại và trạng thái. Hỗ trợ lọc phía client theo thể loại, độ tuổi và trạng thái chiếu. Khi không có kết quả, hiển thị thông báo “Không có phim phù hợp với bộ lọc đang chọn.” Mỗi phim có nút “Chi tiết” để xem thêm và nút “Đặt vé” (hoặc “Sắp chiếu” nếu chưa chiếu).</w:t>
       </w:r>
     </w:p>
     <w:p>
@@ -18398,7 +18208,7 @@
                     </pic:cNvPicPr>
                   </pic:nvPicPr>
                   <pic:blipFill>
-                    <a:blip r:embed="rId16" cstate="print">
+                    <a:blip r:embed="rId18" cstate="print">
                       <a:extLst>
                         <a:ext uri="{28A0092B-C50C-407E-A947-70E740481C1C}">
                           <a14:useLocalDpi xmlns:a14="http://schemas.microsoft.com/office/drawing/2010/main" val="0"/>
@@ -18555,7 +18365,7 @@
                     </pic:cNvPicPr>
                   </pic:nvPicPr>
                   <pic:blipFill>
-                    <a:blip r:embed="rId17">
+                    <a:blip r:embed="rId19">
                       <a:extLst>
                         <a:ext uri="{28A0092B-C50C-407E-A947-70E740481C1C}">
                           <a14:useLocalDpi xmlns:a14="http://schemas.microsoft.com/office/drawing/2010/main" val="0"/>
@@ -18726,7 +18536,7 @@
                     </pic:cNvPicPr>
                   </pic:nvPicPr>
                   <pic:blipFill>
-                    <a:blip r:embed="rId18" cstate="print">
+                    <a:blip r:embed="rId20" cstate="print">
                       <a:extLst>
                         <a:ext uri="{28A0092B-C50C-407E-A947-70E740481C1C}">
                           <a14:useLocalDpi xmlns:a14="http://schemas.microsoft.com/office/drawing/2010/main" val="0"/>
@@ -18892,7 +18702,7 @@
                     </pic:cNvPicPr>
                   </pic:nvPicPr>
                   <pic:blipFill>
-                    <a:blip r:embed="rId19" cstate="print">
+                    <a:blip r:embed="rId21" cstate="print">
                       <a:extLst>
                         <a:ext uri="{28A0092B-C50C-407E-A947-70E740481C1C}">
                           <a14:useLocalDpi xmlns:a14="http://schemas.microsoft.com/office/drawing/2010/main" val="0"/>
@@ -19105,7 +18915,7 @@
                     </pic:cNvPicPr>
                   </pic:nvPicPr>
                   <pic:blipFill>
-                    <a:blip r:embed="rId20" cstate="print">
+                    <a:blip r:embed="rId22" cstate="print">
                       <a:extLst>
                         <a:ext uri="{28A0092B-C50C-407E-A947-70E740481C1C}">
                           <a14:useLocalDpi xmlns:a14="http://schemas.microsoft.com/office/drawing/2010/main" val="0"/>
@@ -19277,7 +19087,7 @@
                     </pic:cNvPicPr>
                   </pic:nvPicPr>
                   <pic:blipFill>
-                    <a:blip r:embed="rId21" cstate="print">
+                    <a:blip r:embed="rId23" cstate="print">
                       <a:extLst>
                         <a:ext uri="{28A0092B-C50C-407E-A947-70E740481C1C}">
                           <a14:useLocalDpi xmlns:a14="http://schemas.microsoft.com/office/drawing/2010/main" val="0"/>
@@ -19322,7 +19132,136 @@
 </w:document>
 </file>
 
-<file path=word/footer1.xml><?xml version="1.0" encoding="utf-8"?>
+<file path=docProps\app.xml><?xml version="1.0" encoding="utf-8"?>
+<Properties xmlns="http://schemas.openxmlformats.org/officeDocument/2006/extended-properties" xmlns:vt="http://schemas.openxmlformats.org/officeDocument/2006/docPropsVTypes">
+  <Pages>31</Pages>
+  <Words>1971</Words>
+  <Characters>7335</Characters>
+  <TotalTime>10</TotalTime>
+  <ScaleCrop>false</ScaleCrop>
+  <LinksUpToDate>false</LinksUpToDate>
+  <CharactersWithSpaces>9121</CharactersWithSpaces>
+  <Application>WPS Office_12.1.0.26880_F1E327BC-269C-435d-A152-05C5408002CA</Application>
+</Properties>
+</file>
+
+<file path=docProps\core.xml><?xml version="1.0" encoding="utf-8"?>
+<cp:coreProperties xmlns:cp="http://schemas.openxmlformats.org/package/2006/metadata/core-properties" xmlns:dc="http://purl.org/dc/elements/1.1/" xmlns:dcterms="http://purl.org/dc/terms/" xmlns:dcmitype="http://purl.org/dc/dcmitype/" xmlns:xsi="http://www.w3.org/2001/XMLSchema-instance">
+  <dcterms:created xsi:type="dcterms:W3CDTF">2026-05-17T15:07:00Z</dcterms:created>
+  <dc:creator>Un-named</dc:creator>
+  <cp:lastModifiedBy>Phạm Trần Tuấn Anh</cp:lastModifiedBy>
+  <dcterms:modified xsi:type="dcterms:W3CDTF">2026-06-07T13:05:46Z</dcterms:modified>
+  <cp:revision>1</cp:revision>
+</cp:coreProperties>
+</file>
+
+<file path=docProps\custom.xml><?xml version="1.0" encoding="utf-8"?>
+<Properties xmlns="http://schemas.openxmlformats.org/officeDocument/2006/custom-properties" xmlns:vt="http://schemas.openxmlformats.org/officeDocument/2006/docPropsVTypes">
+  <property fmtid="{D5CDD505-2E9C-101B-9397-08002B2CF9AE}" pid="2" name="KSOTemplateDocerSaveRecord">
+    <vt:lpwstr>eyJoZGlkIjoiMTFkOWY3ZDk4MjhjOGY1OGZjN2U0ZGZlYjE4NzViMGMiLCJ1c2VySWQiOiIxMzkxOTA4MjkwNDIwIn0=</vt:lpwstr>
+  </property>
+  <property fmtid="{D5CDD505-2E9C-101B-9397-08002B2CF9AE}" pid="3" name="KSOProductBuildVer">
+    <vt:lpwstr>1033-12.1.0.26880</vt:lpwstr>
+  </property>
+  <property fmtid="{D5CDD505-2E9C-101B-9397-08002B2CF9AE}" pid="4" name="ICV">
+    <vt:lpwstr>4F887145BC194C738DED04C852EDAABA_13</vt:lpwstr>
+  </property>
+</Properties>
+</file>
+
+<file path=word\fontTable.xml><?xml version="1.0" encoding="utf-8"?>
+<w:fonts xmlns:mc="http://schemas.openxmlformats.org/markup-compatibility/2006" xmlns:r="http://schemas.openxmlformats.org/officeDocument/2006/relationships" xmlns:w="http://schemas.openxmlformats.org/wordprocessingml/2006/main" xmlns:w14="http://schemas.microsoft.com/office/word/2010/wordml" mc:Ignorable="w14">
+  <w:font w:name="Times New Roman">
+    <w:panose1 w:val="02020603050405020304"/>
+    <w:charset w:val="86"/>
+    <w:family w:val="auto"/>
+    <w:pitch w:val="default"/>
+    <w:sig w:usb0="E0002EFF" w:usb1="C000785B" w:usb2="00000009" w:usb3="00000000" w:csb0="400001FF" w:csb1="FFFF0000"/>
+  </w:font>
+  <w:font w:name="宋体">
+    <w:altName w:val="SimSun"/>
+    <w:panose1 w:val="02010600030101010101"/>
+    <w:charset w:val="86"/>
+    <w:family w:val="auto"/>
+    <w:pitch w:val="variable"/>
+    <w:sig w:usb0="00000003" w:usb1="080E0000" w:usb2="00000010" w:usb3="00000000" w:csb0="00040001" w:csb1="00000000"/>
+  </w:font>
+  <w:font w:name="SimSun">
+    <w:panose1 w:val="02010600030101010101"/>
+    <w:charset w:val="86"/>
+    <w:family w:val="auto"/>
+    <w:pitch w:val="default"/>
+    <w:sig w:usb0="00000203" w:usb1="288F0000" w:usb2="00000006" w:usb3="00000000" w:csb0="00040001" w:csb1="00000000"/>
+  </w:font>
+  <w:font w:name="Arial">
+    <w:panose1 w:val="020B0604020202020204"/>
+    <w:charset w:val="00"/>
+    <w:family w:val="swiss"/>
+    <w:pitch w:val="default"/>
+    <w:sig w:usb0="E0002EFF" w:usb1="C000785B" w:usb2="00000009" w:usb3="00000000" w:csb0="400001FF" w:csb1="FFFF0000"/>
+  </w:font>
+  <w:font w:name="黑体">
+    <w:altName w:val="SimSun"/>
+    <w:panose1 w:val="02010600030101010101"/>
+    <w:charset w:val="86"/>
+    <w:family w:val="auto"/>
+    <w:pitch w:val="default"/>
+    <w:sig w:usb0="00000001" w:usb1="080E0000" w:usb2="00000010" w:usb3="00000000" w:csb0="00040000" w:csb1="00000000"/>
+  </w:font>
+  <w:font w:name="Courier New">
+    <w:panose1 w:val="02070309020205020404"/>
+    <w:charset w:val="00"/>
+    <w:family w:val="modern"/>
+    <w:pitch w:val="default"/>
+    <w:sig w:usb0="E0002EFF" w:usb1="C0007843" w:usb2="00000009" w:usb3="00000000" w:csb0="400001FF" w:csb1="FFFF0000"/>
+  </w:font>
+  <w:font w:name="Wingdings">
+    <w:panose1 w:val="05000000000000000000"/>
+    <w:charset w:val="02"/>
+    <w:family w:val="auto"/>
+    <w:pitch w:val="default"/>
+    <w:sig w:usb0="00000000" w:usb1="00000000" w:usb2="00000000" w:usb3="00000000" w:csb0="80000000" w:csb1="00000000"/>
+  </w:font>
+  <w:font w:name="Calibri">
+    <w:panose1 w:val="020F0502020204030204"/>
+    <w:charset w:val="00"/>
+    <w:family w:val="swiss"/>
+    <w:pitch w:val="default"/>
+    <w:sig w:usb0="E4002EFF" w:usb1="C200247B" w:usb2="00000009" w:usb3="00000000" w:csb0="200001FF" w:csb1="00000000"/>
+  </w:font>
+  <w:font w:name="Aptos">
+    <w:altName w:val="Segoe UI"/>
+    <w:panose1 w:val="020B0004020202020204"/>
+    <w:charset w:val="00"/>
+    <w:family w:val="swiss"/>
+    <w:pitch w:val="default"/>
+    <w:sig w:usb0="00000000" w:usb1="00000000" w:usb2="00000000" w:usb3="00000000" w:csb0="2000019F" w:csb1="00000000"/>
+  </w:font>
+  <w:font w:name="Segoe UI">
+    <w:panose1 w:val="020B0502040204020203"/>
+    <w:charset w:val="00"/>
+    <w:family w:val="auto"/>
+    <w:pitch w:val="default"/>
+    <w:sig w:usb0="E4002EFF" w:usb1="C000E47F" w:usb2="00000009" w:usb3="00000000" w:csb0="200001FF" w:csb1="00000000"/>
+  </w:font>
+  <w:font w:name="Symbol">
+    <w:panose1 w:val="05050102010706020507"/>
+    <w:charset w:val="02"/>
+    <w:family w:val="roman"/>
+    <w:pitch w:val="default"/>
+    <w:sig w:usb0="00000000" w:usb1="00000000" w:usb2="00000000" w:usb3="00000000" w:csb0="80000000" w:csb1="00000000"/>
+  </w:font>
+  <w:font w:name="Tahoma">
+    <w:panose1 w:val="020B0604030504040204"/>
+    <w:charset w:val="00"/>
+    <w:family w:val="auto"/>
+    <w:pitch w:val="default"/>
+    <w:sig w:usb0="E1002EFF" w:usb1="C000605B" w:usb2="00000029" w:usb3="00000000" w:csb0="200101FF" w:csb1="20280000"/>
+  </w:font>
+</w:fonts>
+</file>
+
+<file path=word\footer1.xml><?xml version="1.0" encoding="utf-8"?>
 <w:ftr xmlns:wpc="http://schemas.microsoft.com/office/word/2010/wordprocessingCanvas" xmlns:mc="http://schemas.openxmlformats.org/markup-compatibility/2006" xmlns:o="urn:schemas-microsoft-com:office:office" xmlns:r="http://schemas.openxmlformats.org/officeDocument/2006/relationships" xmlns:m="http://schemas.openxmlformats.org/officeDocument/2006/math" xmlns:v="urn:schemas-microsoft-com:vml" xmlns:wp14="http://schemas.microsoft.com/office/word/2010/wordprocessingDrawing" xmlns:wp="http://schemas.openxmlformats.org/drawingml/2006/wordprocessingDrawing" xmlns:w10="urn:schemas-microsoft-com:office:word" xmlns:w="http://schemas.openxmlformats.org/wordprocessingml/2006/main" xmlns:w14="http://schemas.microsoft.com/office/word/2010/wordml" xmlns:w15="http://schemas.microsoft.com/office/word/2012/wordml" xmlns:wpg="http://schemas.microsoft.com/office/word/2010/wordprocessingGroup" xmlns:wpi="http://schemas.microsoft.com/office/word/2010/wordprocessingInk" xmlns:wne="http://schemas.microsoft.com/office/word/2006/wordml" xmlns:wps="http://schemas.microsoft.com/office/word/2010/wordprocessingShape" xmlns:wpsCustomData="http://www.wps.cn/officeDocument/2013/wpsCustomData" mc:Ignorable="w14 w15 wp14">
   <w:p>
     <w:pPr>
@@ -19422,7 +19361,7 @@
 </w:ftr>
 </file>
 
-<file path=word/header1.xml><?xml version="1.0" encoding="utf-8"?>
+<file path=word\header1.xml><?xml version="1.0" encoding="utf-8"?>
 <w:hdr xmlns:wpc="http://schemas.microsoft.com/office/word/2010/wordprocessingCanvas" xmlns:mc="http://schemas.openxmlformats.org/markup-compatibility/2006" xmlns:o="urn:schemas-microsoft-com:office:office" xmlns:r="http://schemas.openxmlformats.org/officeDocument/2006/relationships" xmlns:m="http://schemas.openxmlformats.org/officeDocument/2006/math" xmlns:v="urn:schemas-microsoft-com:vml" xmlns:wp14="http://schemas.microsoft.com/office/word/2010/wordprocessingDrawing" xmlns:wp="http://schemas.openxmlformats.org/drawingml/2006/wordprocessingDrawing" xmlns:w10="urn:schemas-microsoft-com:office:word" xmlns:w="http://schemas.openxmlformats.org/wordprocessingml/2006/main" xmlns:w14="http://schemas.microsoft.com/office/word/2010/wordml" xmlns:w15="http://schemas.microsoft.com/office/word/2012/wordml" xmlns:wpg="http://schemas.microsoft.com/office/word/2010/wordprocessingGroup" xmlns:wpi="http://schemas.microsoft.com/office/word/2010/wordprocessingInk" xmlns:wne="http://schemas.microsoft.com/office/word/2006/wordml" xmlns:wps="http://schemas.microsoft.com/office/word/2010/wordprocessingShape" xmlns:wpsCustomData="http://www.wps.cn/officeDocument/2013/wpsCustomData" mc:Ignorable="w14 w15 wp14">
   <w:p>
     <w:pPr>
@@ -19446,7 +19385,7 @@
 </w:hdr>
 </file>
 
-<file path=word/numbering.xml><?xml version="1.0" encoding="utf-8"?>
+<file path=word\numbering.xml><?xml version="1.0" encoding="utf-8"?>
 <w:numbering xmlns:wpc="http://schemas.microsoft.com/office/word/2010/wordprocessingCanvas" xmlns:mc="http://schemas.openxmlformats.org/markup-compatibility/2006" xmlns:o="urn:schemas-microsoft-com:office:office" xmlns:r="http://schemas.openxmlformats.org/officeDocument/2006/relationships" xmlns:m="http://schemas.openxmlformats.org/officeDocument/2006/math" xmlns:v="urn:schemas-microsoft-com:vml" xmlns:wp14="http://schemas.microsoft.com/office/word/2010/wordprocessingDrawing" xmlns:wp="http://schemas.openxmlformats.org/drawingml/2006/wordprocessingDrawing" xmlns:w10="urn:schemas-microsoft-com:office:word" xmlns:w="http://schemas.openxmlformats.org/wordprocessingml/2006/main" xmlns:w14="http://schemas.microsoft.com/office/word/2010/wordml" xmlns:wpg="http://schemas.microsoft.com/office/word/2010/wordprocessingGroup" xmlns:wpi="http://schemas.microsoft.com/office/word/2010/wordprocessingInk" xmlns:wne="http://schemas.microsoft.com/office/word/2006/wordml" xmlns:wps="http://schemas.microsoft.com/office/word/2010/wordprocessingShape" xmlns:wpsCustomData="http://www.wps.cn/officeDocument/2013/wpsCustomData" mc:Ignorable="w14 wp14">
   <w:abstractNum w:abstractNumId="0">
     <w:nsid w:val="0053208E"/>
@@ -19955,7 +19894,55 @@
 </w:numbering>
 </file>
 
-<file path=word/styles.xml><?xml version="1.0" encoding="utf-8"?>
+<file path=word\settings.xml><?xml version="1.0" encoding="utf-8"?>
+<w:settings xmlns:mc="http://schemas.openxmlformats.org/markup-compatibility/2006" xmlns:o="urn:schemas-microsoft-com:office:office" xmlns:r="http://schemas.openxmlformats.org/officeDocument/2006/relationships" xmlns:m="http://schemas.openxmlformats.org/officeDocument/2006/math" xmlns:v="urn:schemas-microsoft-com:vml" xmlns:w10="urn:schemas-microsoft-com:office:word" xmlns:w="http://schemas.openxmlformats.org/wordprocessingml/2006/main" xmlns:w14="http://schemas.microsoft.com/office/word/2010/wordml" xmlns:sl="http://schemas.openxmlformats.org/schemaLibrary/2006/main" xmlns:wpsCustomData="http://www.wps.cn/officeDocument/2013/wpsCustomData" mc:Ignorable="w14">
+  <w:zoom w:percent="80"/>
+  <w:displayBackgroundShape w:val="1"/>
+  <w:documentProtection w:enforcement="0"/>
+  <w:compat>
+    <w:compatSetting w:name="compatibilityMode" w:uri="http://schemas.microsoft.com/office/word" w:val="15"/>
+  </w:compat>
+  <w:rsids>
+    <w:rsidRoot w:val="00000000"/>
+    <w:rsid w:val="2EEA5624"/>
+    <w:rsid w:val="4DD827CC"/>
+    <w:rsid w:val="51B246B3"/>
+    <w:rsid w:val="62147845"/>
+    <w:rsid w:val="735930B5"/>
+    <w:rsid w:val="758A1CF4"/>
+  </w:rsids>
+  <m:mathPr>
+    <m:brkBin m:val="before"/>
+    <m:brkBinSub m:val="--"/>
+    <m:smallFrac m:val="0"/>
+    <m:dispDef/>
+    <m:lMargin m:val="0"/>
+    <m:rMargin m:val="0"/>
+    <m:defJc m:val="centerGroup"/>
+    <m:wrapIndent m:val="1440"/>
+    <m:intLim m:val="subSup"/>
+    <m:naryLim m:val="undOvr"/>
+  </m:mathPr>
+  <w:themeFontLang w:val="en-US" w:eastAsia="zh-CN"/>
+  <w:clrSchemeMapping w:bg1="light1" w:t1="dark1" w:bg2="light2" w:t2="dark2" w:accent1="accent1" w:accent2="accent2" w:accent3="accent3" w:accent4="accent4" w:accent5="accent5" w:accent6="accent6" w:hyperlink="hyperlink" w:followedHyperlink="followedHyperlink"/>
+  <w:shapeDefaults>
+    <o:shapedefaults fillcolor="#FFFFFF" fill="t" stroke="t">
+      <v:fill on="t" focussize="0,0"/>
+      <v:stroke color="#000000"/>
+    </o:shapedefaults>
+    <o:shapelayout v:ext="edit">
+      <o:idmap v:ext="edit" data="1"/>
+    </o:shapelayout>
+  </w:shapeDefaults>
+  <mc:AlternateContent>
+    <mc:Choice Requires="wpsCustomData">
+      <wpsCustomData:typoFeatureVersion val="1"/>
+    </mc:Choice>
+  </mc:AlternateContent>
+</w:settings>
+</file>
+
+<file path=word\styles.xml><?xml version="1.0" encoding="utf-8"?>
 <w:styles xmlns:mc="http://schemas.openxmlformats.org/markup-compatibility/2006" xmlns:o="urn:schemas-microsoft-com:office:office" xmlns:r="http://schemas.openxmlformats.org/officeDocument/2006/relationships" xmlns:m="http://schemas.openxmlformats.org/officeDocument/2006/math" xmlns:v="urn:schemas-microsoft-com:vml" xmlns:w="http://schemas.openxmlformats.org/wordprocessingml/2006/main" xmlns:w14="http://schemas.microsoft.com/office/word/2010/wordml" xmlns:w10="urn:schemas-microsoft-com:office:word" xmlns:sl="http://schemas.openxmlformats.org/schemaLibrary/2006/main" xmlns:wpsCustomData="http://www.wps.cn/officeDocument/2013/wpsCustomData" mc:Ignorable="w14">
   <w:docDefaults>
     <w:rPrDefault>
@@ -20485,7 +20472,7 @@
 </w:styles>
 </file>
 
-<file path=word/theme/theme1.xml><?xml version="1.0" encoding="utf-8"?>
+<file path=word\theme\theme1.xml><?xml version="1.0" encoding="utf-8"?>
 <a:theme xmlns:a="http://schemas.openxmlformats.org/drawingml/2006/main" name="Office">
   <a:themeElements>
     <a:clrScheme name="Office">

</xml_diff>